<commit_message>
Remove the ADM section and issue clean copies of the instruction set
Delete C.11 on Alternative Delivery Model Resources and withdraw its entry
from the prior-year change log.

Delete the five empty numbered headings carried over from the prior-year
file. Word numbers them, so they were consuming section numbers and shifting
every heading after them: the timetable rendered as D.6 while the text and
the appendices referred to D.5, and the same shift affected C.6 onwards. The
numbering now matches every cross-reference in the set.

Add FOR_ISSUE copies with the internal notes removed and the review
highlighting cleared. The interoffice conclusion keeps its completion
guidance, which is addressed to the component auditor rather than to us.

Co-Authored-By: Claude Opus 5 <noreply@anthropic.com>
Claude-Session: https://claude.ai/code/session_01T1xmsUUWDmBZ69n2rRaRui
</commit_message>
<xml_diff>
--- a/Faurecia_Korea_2026_Group_audit_instructions_GAI_IN04_PwC_India_draft.docx
+++ b/Faurecia_Korea_2026_Group_audit_instructions_GAI_IN04_PwC_India_draft.docx
@@ -8202,7 +8202,7 @@
           <w:lang w:val="en-US"/>
           <w:highlight w:val="yellow"/>
         </w:rPr>
-        <w:t xml:space="preserve">[Updated - shown in yellow] (i) period references and reporting deadlines rolled forward to the year ending December 31, 2026; (ii) Group background and significant developments refreshed from the Forvia Group auditor’s HY26 instructions (Ignite plan, COLORADO disposal, SIMPLIFY project); (iii) the Mazars Audit Manual requirement removed; (iv) component auditor procedures over intercompany balances and transactions added; (v) fraud risk factors, journal entry selection criteria and the data extraction process added; (vi) a new section on the use of technological resources, including Technology Audit Solutions and GenAI; (vii) a new section on Alternative Delivery Model Resources; and (viii) component materiality levels updated.</w:t>
+        <w:t xml:space="preserve">[Updated - shown in yellow] (i) period references and reporting deadlines rolled forward to the year ending December 31, 2026; (ii) Group background and significant developments refreshed from the Forvia Group auditor’s HY26 instructions (Ignite plan, COLORADO disposal, SIMPLIFY project); (iii) the Mazars Audit Manual requirement removed; (iv) component auditor procedures over intercompany balances and transactions added; (v) fraud risk factors, journal entry selection criteria and the data extraction process added; (vi) a new section on the use of technological resources, including Technology Audit Solutions and GenAI; and (vii) component materiality levels updated.</w:t>
       </w:r>
     </w:p>
     <w:p>
@@ -8216,7 +8216,7 @@
           <w:lang w:val="en-US"/>
           <w:highlight w:val="cyan"/>
         </w:rPr>
-        <w:t xml:space="preserve">[To be confirmed - shown in turquoise] (a) the Group background, technological resources and Alternative Delivery Model sections are sourced from the Forvia Group auditor’s HY26 interim review instructions and are to be re-confirmed against the Forvia FY2026 annual instructions when received; (b) the reporting deadlines have been set on the same weekday as the prior year and require confirmation; and (c) the component materiality levels for IN04 are to be compared with your own statutory audit materiality once notified to us in Appendix A.</w:t>
+        <w:t xml:space="preserve">[To be confirmed - shown in turquoise] (a) the Group background and technological resources sections are sourced from the Forvia Group auditor’s HY26 interim review instructions and are to be re-confirmed against the Forvia FY2026 annual instructions when received; (b) the reporting deadlines have been set on the same weekday as the prior year and require confirmation; and (c) the component materiality levels for IN04 are to be compared with your own statutory audit materiality once notified to us in Appendix A.</w:t>
       </w:r>
     </w:p>
     <w:p>
@@ -13973,19 +13973,6 @@
     <w:p>
       <w:pPr>
         <w:pStyle w:val="3"/>
-        <w:numPr>
-          <w:ilvl w:val="0"/>
-          <w:numId w:val="0"/>
-        </w:numPr>
-        <w:ind w:left="1117"/>
-        <w:rPr>
-          <w:lang w:val="en-US"/>
-        </w:rPr>
-      </w:pPr>
-    </w:p>
-    <w:p>
-      <w:pPr>
-        <w:pStyle w:val="3"/>
         <w:rPr>
           <w:lang w:val="en-US"/>
         </w:rPr>
@@ -14401,20 +14388,6 @@
     <w:p>
       <w:pPr>
         <w:pStyle w:val="2"/>
-        <w:numPr>
-          <w:ilvl w:val="0"/>
-          <w:numId w:val="0"/>
-        </w:numPr>
-        <w:ind w:left="757"/>
-        <w:rPr>
-          <w:lang w:val="en-GB"/>
-        </w:rPr>
-      </w:pPr>
-      <w:bookmarkStart w:id="67" w:name="_Toc215844443"/>
-    </w:p>
-    <w:p>
-      <w:pPr>
-        <w:pStyle w:val="2"/>
         <w:rPr>
           <w:lang w:val="en-GB"/>
         </w:rPr>
@@ -14577,19 +14550,6 @@
         </w:rPr>
         <w:t xml:space="preserve"> please provide detailed information regarding the Component's operations and financial condition, as well as related regulatory requirements where applicable. </w:t>
       </w:r>
-    </w:p>
-    <w:p>
-      <w:pPr>
-        <w:pStyle w:val="2"/>
-        <w:numPr>
-          <w:ilvl w:val="0"/>
-          <w:numId w:val="0"/>
-        </w:numPr>
-        <w:ind w:left="757"/>
-        <w:rPr>
-          <w:lang w:val="en-US"/>
-        </w:rPr>
-      </w:pPr>
     </w:p>
     <w:p>
       <w:pPr>
@@ -15584,100 +15544,6 @@
           <w:lang w:val="en-US"/>
         </w:rPr>
       </w:pPr>
-      <w:r>
-        <w:rPr>
-          <w:lang w:val="en-US"/>
-          <w:highlight w:val="yellow"/>
-        </w:rPr>
-        <w:t xml:space="preserve">Approach to involvement of Alternative Delivery Model Resources</w:t>
-      </w:r>
-    </w:p>
-    <w:p>
-      <w:pPr>
-        <w:rPr>
-          <w:lang w:val="en-US"/>
-        </w:rPr>
-      </w:pPr>
-      <w:r>
-        <w:rPr>
-          <w:lang w:val="en-US"/>
-          <w:highlight w:val="yellow"/>
-        </w:rPr>
-        <w:t xml:space="preserve">Inform us if you expect to involve alternative delivery model resources, including Service Delivery Centers, in the work you perform for the Group audit and, if you do, we request that you provide details of this involvement:</w:t>
-      </w:r>
-    </w:p>
-    <w:p>
-      <w:pPr>
-        <w:pStyle w:val="a6"/>
-        <w:numPr>
-          <w:ilvl w:val="0"/>
-          <w:numId w:val="18"/>
-        </w:numPr>
-        <w:rPr>
-          <w:lang w:val="en-US"/>
-        </w:rPr>
-      </w:pPr>
-      <w:r>
-        <w:rPr>
-          <w:lang w:val="en-US"/>
-          <w:highlight w:val="yellow"/>
-        </w:rPr>
-        <w:t xml:space="preserve">The nature of the work performed under this alternative delivery model;</w:t>
-      </w:r>
-    </w:p>
-    <w:p>
-      <w:pPr>
-        <w:pStyle w:val="a6"/>
-        <w:numPr>
-          <w:ilvl w:val="0"/>
-          <w:numId w:val="18"/>
-        </w:numPr>
-        <w:rPr>
-          <w:lang w:val="en-US"/>
-        </w:rPr>
-      </w:pPr>
-      <w:r>
-        <w:rPr>
-          <w:lang w:val="en-US"/>
-          <w:highlight w:val="yellow"/>
-        </w:rPr>
-        <w:t xml:space="preserve">The supervision and review processes implemented by the component auditor;</w:t>
-      </w:r>
-    </w:p>
-    <w:p>
-      <w:pPr>
-        <w:pStyle w:val="a6"/>
-        <w:numPr>
-          <w:ilvl w:val="0"/>
-          <w:numId w:val="18"/>
-        </w:numPr>
-        <w:rPr>
-          <w:lang w:val="en-US"/>
-        </w:rPr>
-      </w:pPr>
-      <w:r>
-        <w:rPr>
-          <w:lang w:val="en-US"/>
-          <w:highlight w:val="yellow"/>
-        </w:rPr>
-        <w:t xml:space="preserve">The geographical location of the resources involved.</w:t>
-      </w:r>
-    </w:p>
-    <w:p>
-      <w:pPr>
-        <w:pStyle w:val="a6"/>
-        <w:rPr>
-          <w:lang w:val="en-US"/>
-        </w:rPr>
-      </w:pPr>
-    </w:p>
-    <w:p>
-      <w:pPr>
-        <w:pStyle w:val="2"/>
-        <w:rPr>
-          <w:lang w:val="en-US"/>
-        </w:rPr>
-      </w:pPr>
       <w:bookmarkStart w:id="71" w:name="_Toc215844447"/>
       <w:r>
         <w:rPr>
@@ -16106,20 +15972,6 @@
     <w:p>
       <w:pPr>
         <w:pStyle w:val="3"/>
-        <w:numPr>
-          <w:ilvl w:val="0"/>
-          <w:numId w:val="0"/>
-        </w:numPr>
-        <w:ind w:left="1117"/>
-        <w:rPr>
-          <w:lang w:val="en-US"/>
-        </w:rPr>
-      </w:pPr>
-      <w:bookmarkStart w:id="75" w:name="_Toc520974854"/>
-    </w:p>
-    <w:p>
-      <w:pPr>
-        <w:pStyle w:val="3"/>
         <w:rPr>
           <w:lang w:val="en-US"/>
         </w:rPr>
@@ -16200,16 +16052,6 @@
         </w:rPr>
         <w:t xml:space="preserve"> </w:t>
       </w:r>
-    </w:p>
-    <w:p>
-      <w:pPr>
-        <w:pStyle w:val="2"/>
-        <w:numPr>
-          <w:ilvl w:val="0"/>
-          <w:numId w:val="0"/>
-        </w:numPr>
-        <w:ind w:left="757"/>
-      </w:pPr>
     </w:p>
     <w:p>
       <w:pPr>

</xml_diff>